<commit_message>
Updated Project 3 files
</commit_message>
<xml_diff>
--- a/IS607/Project3/Project3Outline.docx
+++ b/IS607/Project3/Project3Outline.docx
@@ -181,8 +181,8 @@
         <w:shd w:val="clear" w:color="auto" w:fill="FFFFFF"/>
         <w:spacing w:line="75" w:lineRule="atLeast"/>
         <w:rPr>
+          <w:rStyle w:val="Hyperlink"/>
           <w:rFonts w:ascii="Segoe UI" w:hAnsi="Segoe UI" w:cs="Segoe UI"/>
-          <w:color w:val="044444"/>
           <w:sz w:val="17"/>
           <w:szCs w:val="17"/>
         </w:rPr>
@@ -219,9 +219,70 @@
       </w:hyperlink>
     </w:p>
     <w:p>
+      <w:pPr>
+        <w:pStyle w:val="NormalWeb"/>
+        <w:shd w:val="clear" w:color="auto" w:fill="FFFFFF"/>
+        <w:spacing w:line="75" w:lineRule="atLeast"/>
+        <w:rPr>
+          <w:rFonts w:ascii="Segoe UI" w:hAnsi="Segoe UI" w:cs="Segoe UI"/>
+          <w:color w:val="044444"/>
+          <w:sz w:val="17"/>
+          <w:szCs w:val="17"/>
+        </w:rPr>
+      </w:pPr>
+      <w:r>
+        <w:rPr>
+          <w:rFonts w:ascii="Segoe UI" w:hAnsi="Segoe UI" w:cs="Segoe UI"/>
+          <w:color w:val="044444"/>
+          <w:sz w:val="17"/>
+          <w:szCs w:val="17"/>
+        </w:rPr>
+        <w:t xml:space="preserve">10/18 Slack, </w:t>
+      </w:r>
+      <w:proofErr w:type="spellStart"/>
+      <w:r>
+        <w:rPr>
+          <w:rFonts w:ascii="Segoe UI" w:hAnsi="Segoe UI" w:cs="Segoe UI"/>
+          <w:color w:val="044444"/>
+          <w:sz w:val="17"/>
+          <w:szCs w:val="17"/>
+        </w:rPr>
+        <w:t>updloaded</w:t>
+      </w:r>
+      <w:proofErr w:type="spellEnd"/>
+      <w:r>
+        <w:rPr>
+          <w:rFonts w:ascii="Segoe UI" w:hAnsi="Segoe UI" w:cs="Segoe UI"/>
+          <w:color w:val="044444"/>
+          <w:sz w:val="17"/>
+          <w:szCs w:val="17"/>
+        </w:rPr>
+        <w:t xml:space="preserve"> code and csv. </w:t>
+      </w:r>
+      <w:proofErr w:type="spellStart"/>
+      <w:r>
+        <w:rPr>
+          <w:rFonts w:ascii="Segoe UI" w:hAnsi="Segoe UI" w:cs="Segoe UI"/>
+          <w:color w:val="044444"/>
+          <w:sz w:val="17"/>
+          <w:szCs w:val="17"/>
+        </w:rPr>
+        <w:t>Additaionl</w:t>
+      </w:r>
+      <w:proofErr w:type="spellEnd"/>
+      <w:r>
+        <w:rPr>
+          <w:rFonts w:ascii="Segoe UI" w:hAnsi="Segoe UI" w:cs="Segoe UI"/>
+          <w:color w:val="044444"/>
+          <w:sz w:val="17"/>
+          <w:szCs w:val="17"/>
+        </w:rPr>
+        <w:t xml:space="preserve"> analysis and graphs needed.</w:t>
+      </w:r>
       <w:bookmarkStart w:id="0" w:name="_GoBack"/>
       <w:bookmarkEnd w:id="0"/>
     </w:p>
+    <w:p/>
     <w:p/>
     <w:p>
       <w:r>
@@ -404,6 +465,7 @@
         </w:numPr>
       </w:pPr>
       <w:r>
+        <w:lastRenderedPageBreak/>
         <w:t xml:space="preserve">How does it change </w:t>
       </w:r>
       <w:proofErr w:type="gramStart"/>
@@ -1419,6 +1481,7 @@
   <w:style w:type="character" w:default="1" w:styleId="DefaultParagraphFont">
     <w:name w:val="Default Paragraph Font"/>
     <w:uiPriority w:val="1"/>
+    <w:semiHidden/>
     <w:unhideWhenUsed/>
   </w:style>
   <w:style w:type="table" w:default="1" w:styleId="TableNormal">

</xml_diff>